<commit_message>
Avanzar en AD, PSP y DI
</commit_message>
<xml_diff>
--- a/SGE/UD3.Practica1.docx
+++ b/SGE/UD3.Practica1.docx
@@ -870,7 +870,7 @@
       </w:pPr>
       <w:r>
         <w:drawing>
-          <wp:anchor behindDoc="0" distT="0" distB="0" distL="0" distR="0" simplePos="0" locked="0" layoutInCell="0" allowOverlap="1" relativeHeight="14">
+          <wp:anchor behindDoc="0" distT="0" distB="0" distL="0" distR="0" simplePos="0" locked="0" layoutInCell="0" allowOverlap="1" relativeHeight="29">
             <wp:simplePos x="0" y="0"/>
             <wp:positionH relativeFrom="column">
               <wp:posOffset>534035</wp:posOffset>
@@ -896,7 +896,7 @@
                   </pic:nvPicPr>
                   <pic:blipFill>
                     <a:blip r:embed="rId2"/>
-                    <a:srcRect l="0" t="0" r="0" b="70742"/>
+                    <a:srcRect l="0" t="0" r="0" b="70731"/>
                     <a:stretch>
                       <a:fillRect/>
                     </a:stretch>
@@ -1237,6 +1237,32 @@
       <w:pPr>
         <w:pStyle w:val="ListParagraph"/>
         <w:numPr>
+          <w:ilvl w:val="0"/>
+          <w:numId w:val="0"/>
+        </w:numPr>
+        <w:tabs>
+          <w:tab w:val="clear" w:pos="720"/>
+          <w:tab w:val="left" w:pos="1788" w:leader="none"/>
+        </w:tabs>
+        <w:spacing w:lineRule="exact" w:line="243" w:before="2" w:after="0"/>
+        <w:ind w:hanging="0" w:left="1788" w:right="0"/>
+        <w:jc w:val="left"/>
+        <w:rPr>
+          <w:sz w:val="20"/>
+        </w:rPr>
+      </w:pPr>
+      <w:r>
+        <w:rPr>
+          <w:spacing w:val="-2"/>
+          <w:sz w:val="20"/>
+        </w:rPr>
+        <w:t>edu-mimibien1.odoo.com</w:t>
+      </w:r>
+    </w:p>
+    <w:p>
+      <w:pPr>
+        <w:pStyle w:val="ListParagraph"/>
+        <w:numPr>
           <w:ilvl w:val="2"/>
           <w:numId w:val="1"/>
         </w:numPr>
@@ -1285,6 +1311,29 @@
           <w:sz w:val="20"/>
         </w:rPr>
         <w:t>Compañía</w:t>
+      </w:r>
+    </w:p>
+    <w:p>
+      <w:pPr>
+        <w:pStyle w:val="ListParagraph"/>
+        <w:numPr>
+          <w:ilvl w:val="0"/>
+          <w:numId w:val="0"/>
+        </w:numPr>
+        <w:tabs>
+          <w:tab w:val="clear" w:pos="720"/>
+          <w:tab w:val="left" w:pos="1788" w:leader="none"/>
+        </w:tabs>
+        <w:spacing w:lineRule="exact" w:line="242" w:before="0" w:after="0"/>
+        <w:ind w:hanging="0" w:left="1788" w:right="0"/>
+        <w:jc w:val="left"/>
+        <w:rPr>
+          <w:b/>
+          <w:sz w:val="20"/>
+        </w:rPr>
+      </w:pPr>
+      <w:r>
+        <w:rPr/>
       </w:r>
     </w:p>
     <w:p>
@@ -1389,6 +1438,117 @@
           <w:sz w:val="20"/>
         </w:rPr>
         <w:t>logo</w:t>
+      </w:r>
+    </w:p>
+    <w:p>
+      <w:pPr>
+        <w:pStyle w:val="ListParagraph"/>
+        <w:numPr>
+          <w:ilvl w:val="0"/>
+          <w:numId w:val="0"/>
+        </w:numPr>
+        <w:tabs>
+          <w:tab w:val="clear" w:pos="720"/>
+          <w:tab w:val="left" w:pos="1788" w:leader="none"/>
+        </w:tabs>
+        <w:spacing w:lineRule="exact" w:line="243" w:before="0" w:after="0"/>
+        <w:ind w:hanging="0" w:left="1788" w:right="0"/>
+        <w:jc w:val="left"/>
+        <w:rPr/>
+      </w:pPr>
+      <w:r>
+        <w:rPr/>
+        <w:drawing>
+          <wp:anchor behindDoc="0" distT="0" distB="0" distL="0" distR="0" simplePos="0" locked="0" layoutInCell="0" allowOverlap="1" relativeHeight="31">
+            <wp:simplePos x="0" y="0"/>
+            <wp:positionH relativeFrom="column">
+              <wp:posOffset>936625</wp:posOffset>
+            </wp:positionH>
+            <wp:positionV relativeFrom="paragraph">
+              <wp:posOffset>3134995</wp:posOffset>
+            </wp:positionV>
+            <wp:extent cx="3979545" cy="1438910"/>
+            <wp:effectExtent l="0" t="0" r="0" b="0"/>
+            <wp:wrapSquare wrapText="largest"/>
+            <wp:docPr id="2" name="Image3" descr=""/>
+            <wp:cNvGraphicFramePr>
+              <a:graphicFrameLocks xmlns:a="http://schemas.openxmlformats.org/drawingml/2006/main" noChangeAspect="1"/>
+            </wp:cNvGraphicFramePr>
+            <a:graphic xmlns:a="http://schemas.openxmlformats.org/drawingml/2006/main">
+              <a:graphicData uri="http://schemas.openxmlformats.org/drawingml/2006/picture">
+                <pic:pic xmlns:pic="http://schemas.openxmlformats.org/drawingml/2006/picture">
+                  <pic:nvPicPr>
+                    <pic:cNvPr id="2" name="Image3" descr=""/>
+                    <pic:cNvPicPr>
+                      <a:picLocks noChangeAspect="1" noChangeArrowheads="1"/>
+                    </pic:cNvPicPr>
+                  </pic:nvPicPr>
+                  <pic:blipFill>
+                    <a:blip r:embed="rId3"/>
+                    <a:stretch>
+                      <a:fillRect/>
+                    </a:stretch>
+                  </pic:blipFill>
+                  <pic:spPr bwMode="auto">
+                    <a:xfrm>
+                      <a:off x="0" y="0"/>
+                      <a:ext cx="3979545" cy="1438910"/>
+                    </a:xfrm>
+                    <a:prstGeom prst="rect">
+                      <a:avLst/>
+                    </a:prstGeom>
+                  </pic:spPr>
+                </pic:pic>
+              </a:graphicData>
+            </a:graphic>
+          </wp:anchor>
+        </w:drawing>
+        <w:drawing>
+          <wp:anchor behindDoc="0" distT="0" distB="0" distL="0" distR="0" simplePos="0" locked="0" layoutInCell="0" allowOverlap="1" relativeHeight="30">
+            <wp:simplePos x="0" y="0"/>
+            <wp:positionH relativeFrom="column">
+              <wp:posOffset>978535</wp:posOffset>
+            </wp:positionH>
+            <wp:positionV relativeFrom="paragraph">
+              <wp:posOffset>112395</wp:posOffset>
+            </wp:positionV>
+            <wp:extent cx="3926840" cy="2880995"/>
+            <wp:effectExtent l="0" t="0" r="0" b="0"/>
+            <wp:wrapSquare wrapText="largest"/>
+            <wp:docPr id="3" name="Image2" descr=""/>
+            <wp:cNvGraphicFramePr>
+              <a:graphicFrameLocks xmlns:a="http://schemas.openxmlformats.org/drawingml/2006/main" noChangeAspect="1"/>
+            </wp:cNvGraphicFramePr>
+            <a:graphic xmlns:a="http://schemas.openxmlformats.org/drawingml/2006/main">
+              <a:graphicData uri="http://schemas.openxmlformats.org/drawingml/2006/picture">
+                <pic:pic xmlns:pic="http://schemas.openxmlformats.org/drawingml/2006/picture">
+                  <pic:nvPicPr>
+                    <pic:cNvPr id="3" name="Image2" descr=""/>
+                    <pic:cNvPicPr>
+                      <a:picLocks noChangeAspect="1" noChangeArrowheads="1"/>
+                    </pic:cNvPicPr>
+                  </pic:nvPicPr>
+                  <pic:blipFill>
+                    <a:blip r:embed="rId4"/>
+                    <a:srcRect l="6693" t="22270" r="0" b="14540"/>
+                    <a:stretch>
+                      <a:fillRect/>
+                    </a:stretch>
+                  </pic:blipFill>
+                  <pic:spPr bwMode="auto">
+                    <a:xfrm>
+                      <a:off x="0" y="0"/>
+                      <a:ext cx="3926840" cy="2880995"/>
+                    </a:xfrm>
+                    <a:prstGeom prst="rect">
+                      <a:avLst/>
+                    </a:prstGeom>
+                  </pic:spPr>
+                </pic:pic>
+              </a:graphicData>
+            </a:graphic>
+          </wp:anchor>
+        </w:drawing>
       </w:r>
     </w:p>
     <w:p>
@@ -1564,6 +1724,74 @@
       <w:pPr>
         <w:pStyle w:val="ListParagraph"/>
         <w:numPr>
+          <w:ilvl w:val="0"/>
+          <w:numId w:val="0"/>
+        </w:numPr>
+        <w:tabs>
+          <w:tab w:val="clear" w:pos="720"/>
+          <w:tab w:val="left" w:pos="1787" w:leader="none"/>
+          <w:tab w:val="left" w:pos="1789" w:leader="none"/>
+        </w:tabs>
+        <w:spacing w:lineRule="auto" w:line="240" w:before="2" w:after="0"/>
+        <w:ind w:hanging="0" w:left="1789" w:right="142"/>
+        <w:jc w:val="left"/>
+        <w:rPr>
+          <w:sz w:val="20"/>
+        </w:rPr>
+      </w:pPr>
+      <w:r>
+        <w:rPr/>
+        <w:drawing>
+          <wp:anchor behindDoc="0" distT="0" distB="0" distL="0" distR="0" simplePos="0" locked="0" layoutInCell="0" allowOverlap="1" relativeHeight="32">
+            <wp:simplePos x="0" y="0"/>
+            <wp:positionH relativeFrom="column">
+              <wp:align>center</wp:align>
+            </wp:positionH>
+            <wp:positionV relativeFrom="paragraph">
+              <wp:posOffset>635</wp:posOffset>
+            </wp:positionV>
+            <wp:extent cx="4493260" cy="1169035"/>
+            <wp:effectExtent l="0" t="0" r="0" b="0"/>
+            <wp:wrapSquare wrapText="largest"/>
+            <wp:docPr id="4" name="Image4" descr=""/>
+            <wp:cNvGraphicFramePr>
+              <a:graphicFrameLocks xmlns:a="http://schemas.openxmlformats.org/drawingml/2006/main" noChangeAspect="1"/>
+            </wp:cNvGraphicFramePr>
+            <a:graphic xmlns:a="http://schemas.openxmlformats.org/drawingml/2006/main">
+              <a:graphicData uri="http://schemas.openxmlformats.org/drawingml/2006/picture">
+                <pic:pic xmlns:pic="http://schemas.openxmlformats.org/drawingml/2006/picture">
+                  <pic:nvPicPr>
+                    <pic:cNvPr id="4" name="Image4" descr=""/>
+                    <pic:cNvPicPr>
+                      <a:picLocks noChangeAspect="1" noChangeArrowheads="1"/>
+                    </pic:cNvPicPr>
+                  </pic:nvPicPr>
+                  <pic:blipFill>
+                    <a:blip r:embed="rId5"/>
+                    <a:stretch>
+                      <a:fillRect/>
+                    </a:stretch>
+                  </pic:blipFill>
+                  <pic:spPr bwMode="auto">
+                    <a:xfrm>
+                      <a:off x="0" y="0"/>
+                      <a:ext cx="4493260" cy="1169035"/>
+                    </a:xfrm>
+                    <a:prstGeom prst="rect">
+                      <a:avLst/>
+                    </a:prstGeom>
+                  </pic:spPr>
+                </pic:pic>
+              </a:graphicData>
+            </a:graphic>
+          </wp:anchor>
+        </w:drawing>
+      </w:r>
+    </w:p>
+    <w:p>
+      <w:pPr>
+        <w:pStyle w:val="ListParagraph"/>
+        <w:numPr>
           <w:ilvl w:val="2"/>
           <w:numId w:val="1"/>
         </w:numPr>
@@ -1719,6 +1947,73 @@
       <w:pPr>
         <w:pStyle w:val="ListParagraph"/>
         <w:numPr>
+          <w:ilvl w:val="0"/>
+          <w:numId w:val="0"/>
+        </w:numPr>
+        <w:tabs>
+          <w:tab w:val="clear" w:pos="720"/>
+          <w:tab w:val="left" w:pos="1788" w:leader="none"/>
+        </w:tabs>
+        <w:spacing w:lineRule="exact" w:line="243" w:before="0" w:after="0"/>
+        <w:ind w:hanging="0" w:left="1788" w:right="0"/>
+        <w:jc w:val="left"/>
+        <w:rPr>
+          <w:sz w:val="20"/>
+        </w:rPr>
+      </w:pPr>
+      <w:r>
+        <w:rPr/>
+        <w:drawing>
+          <wp:anchor behindDoc="0" distT="0" distB="0" distL="0" distR="0" simplePos="0" locked="0" layoutInCell="0" allowOverlap="1" relativeHeight="33">
+            <wp:simplePos x="0" y="0"/>
+            <wp:positionH relativeFrom="column">
+              <wp:align>center</wp:align>
+            </wp:positionH>
+            <wp:positionV relativeFrom="paragraph">
+              <wp:posOffset>635</wp:posOffset>
+            </wp:positionV>
+            <wp:extent cx="4583430" cy="4658995"/>
+            <wp:effectExtent l="0" t="0" r="0" b="0"/>
+            <wp:wrapSquare wrapText="largest"/>
+            <wp:docPr id="5" name="Image5" descr=""/>
+            <wp:cNvGraphicFramePr>
+              <a:graphicFrameLocks xmlns:a="http://schemas.openxmlformats.org/drawingml/2006/main" noChangeAspect="1"/>
+            </wp:cNvGraphicFramePr>
+            <a:graphic xmlns:a="http://schemas.openxmlformats.org/drawingml/2006/main">
+              <a:graphicData uri="http://schemas.openxmlformats.org/drawingml/2006/picture">
+                <pic:pic xmlns:pic="http://schemas.openxmlformats.org/drawingml/2006/picture">
+                  <pic:nvPicPr>
+                    <pic:cNvPr id="5" name="Image5" descr=""/>
+                    <pic:cNvPicPr>
+                      <a:picLocks noChangeAspect="1" noChangeArrowheads="1"/>
+                    </pic:cNvPicPr>
+                  </pic:nvPicPr>
+                  <pic:blipFill>
+                    <a:blip r:embed="rId6"/>
+                    <a:stretch>
+                      <a:fillRect/>
+                    </a:stretch>
+                  </pic:blipFill>
+                  <pic:spPr bwMode="auto">
+                    <a:xfrm>
+                      <a:off x="0" y="0"/>
+                      <a:ext cx="4583430" cy="4658995"/>
+                    </a:xfrm>
+                    <a:prstGeom prst="rect">
+                      <a:avLst/>
+                    </a:prstGeom>
+                  </pic:spPr>
+                </pic:pic>
+              </a:graphicData>
+            </a:graphic>
+          </wp:anchor>
+        </w:drawing>
+      </w:r>
+    </w:p>
+    <w:p>
+      <w:pPr>
+        <w:pStyle w:val="ListParagraph"/>
+        <w:numPr>
           <w:ilvl w:val="2"/>
           <w:numId w:val="1"/>
         </w:numPr>
@@ -1738,6 +2033,71 @@
           <w:sz w:val="20"/>
         </w:rPr>
         <w:t>Crea un nuevo contacto que pertenezca a la empresa que acabas de crear</w:t>
+      </w:r>
+    </w:p>
+    <w:p>
+      <w:pPr>
+        <w:pStyle w:val="ListParagraph"/>
+        <w:numPr>
+          <w:ilvl w:val="0"/>
+          <w:numId w:val="0"/>
+        </w:numPr>
+        <w:tabs>
+          <w:tab w:val="clear" w:pos="720"/>
+          <w:tab w:val="left" w:pos="1789" w:leader="none"/>
+        </w:tabs>
+        <w:spacing w:lineRule="auto" w:line="240" w:before="0" w:after="0"/>
+        <w:ind w:hanging="0" w:left="1789" w:right="140"/>
+        <w:jc w:val="left"/>
+        <w:rPr/>
+      </w:pPr>
+      <w:r>
+        <w:rPr/>
+        <w:drawing>
+          <wp:anchor behindDoc="0" distT="0" distB="0" distL="0" distR="0" simplePos="0" locked="0" layoutInCell="0" allowOverlap="1" relativeHeight="34">
+            <wp:simplePos x="0" y="0"/>
+            <wp:positionH relativeFrom="column">
+              <wp:align>center</wp:align>
+            </wp:positionH>
+            <wp:positionV relativeFrom="paragraph">
+              <wp:posOffset>635</wp:posOffset>
+            </wp:positionV>
+            <wp:extent cx="2630805" cy="4131310"/>
+            <wp:effectExtent l="0" t="0" r="0" b="0"/>
+            <wp:wrapTopAndBottom/>
+            <wp:docPr id="6" name="Image6" descr=""/>
+            <wp:cNvGraphicFramePr>
+              <a:graphicFrameLocks xmlns:a="http://schemas.openxmlformats.org/drawingml/2006/main" noChangeAspect="1"/>
+            </wp:cNvGraphicFramePr>
+            <a:graphic xmlns:a="http://schemas.openxmlformats.org/drawingml/2006/main">
+              <a:graphicData uri="http://schemas.openxmlformats.org/drawingml/2006/picture">
+                <pic:pic xmlns:pic="http://schemas.openxmlformats.org/drawingml/2006/picture">
+                  <pic:nvPicPr>
+                    <pic:cNvPr id="6" name="Image6" descr=""/>
+                    <pic:cNvPicPr>
+                      <a:picLocks noChangeAspect="1" noChangeArrowheads="1"/>
+                    </pic:cNvPicPr>
+                  </pic:nvPicPr>
+                  <pic:blipFill>
+                    <a:blip r:embed="rId7"/>
+                    <a:stretch>
+                      <a:fillRect/>
+                    </a:stretch>
+                  </pic:blipFill>
+                  <pic:spPr bwMode="auto">
+                    <a:xfrm>
+                      <a:off x="0" y="0"/>
+                      <a:ext cx="2630805" cy="4131310"/>
+                    </a:xfrm>
+                    <a:prstGeom prst="rect">
+                      <a:avLst/>
+                    </a:prstGeom>
+                  </pic:spPr>
+                </pic:pic>
+              </a:graphicData>
+            </a:graphic>
+          </wp:anchor>
+        </w:drawing>
       </w:r>
     </w:p>
     <w:p>
@@ -1760,6 +2120,54 @@
         </w:rPr>
       </w:pPr>
       <w:r>
+        <w:drawing>
+          <wp:anchor behindDoc="0" distT="0" distB="0" distL="0" distR="0" simplePos="0" locked="0" layoutInCell="0" allowOverlap="1" relativeHeight="35">
+            <wp:simplePos x="0" y="0"/>
+            <wp:positionH relativeFrom="column">
+              <wp:posOffset>603250</wp:posOffset>
+            </wp:positionH>
+            <wp:positionV relativeFrom="paragraph">
+              <wp:posOffset>395605</wp:posOffset>
+            </wp:positionV>
+            <wp:extent cx="4018280" cy="4117975"/>
+            <wp:effectExtent l="0" t="0" r="0" b="0"/>
+            <wp:wrapTopAndBottom/>
+            <wp:docPr id="7" name="Image7" descr=""/>
+            <wp:cNvGraphicFramePr>
+              <a:graphicFrameLocks xmlns:a="http://schemas.openxmlformats.org/drawingml/2006/main" noChangeAspect="1"/>
+            </wp:cNvGraphicFramePr>
+            <a:graphic xmlns:a="http://schemas.openxmlformats.org/drawingml/2006/main">
+              <a:graphicData uri="http://schemas.openxmlformats.org/drawingml/2006/picture">
+                <pic:pic xmlns:pic="http://schemas.openxmlformats.org/drawingml/2006/picture">
+                  <pic:nvPicPr>
+                    <pic:cNvPr id="7" name="Image7" descr=""/>
+                    <pic:cNvPicPr>
+                      <a:picLocks noChangeAspect="1" noChangeArrowheads="1"/>
+                    </pic:cNvPicPr>
+                  </pic:nvPicPr>
+                  <pic:blipFill>
+                    <a:blip r:embed="rId8"/>
+                    <a:srcRect l="5807" t="10877" r="0" b="0"/>
+                    <a:stretch>
+                      <a:fillRect/>
+                    </a:stretch>
+                  </pic:blipFill>
+                  <pic:spPr bwMode="auto">
+                    <a:xfrm>
+                      <a:off x="0" y="0"/>
+                      <a:ext cx="4018280" cy="4117975"/>
+                    </a:xfrm>
+                    <a:prstGeom prst="rect">
+                      <a:avLst/>
+                    </a:prstGeom>
+                  </pic:spPr>
+                </pic:pic>
+              </a:graphicData>
+            </a:graphic>
+          </wp:anchor>
+        </w:drawing>
+      </w:r>
+      <w:r>
         <w:rPr>
           <w:sz w:val="20"/>
         </w:rPr>
@@ -2169,12 +2577,12 @@
       </w:r>
     </w:p>
     <w:sectPr>
-      <w:headerReference w:type="even" r:id="rId3"/>
-      <w:headerReference w:type="default" r:id="rId4"/>
-      <w:headerReference w:type="first" r:id="rId5"/>
-      <w:footerReference w:type="even" r:id="rId6"/>
-      <w:footerReference w:type="default" r:id="rId7"/>
-      <w:footerReference w:type="first" r:id="rId8"/>
+      <w:headerReference w:type="even" r:id="rId9"/>
+      <w:headerReference w:type="default" r:id="rId10"/>
+      <w:headerReference w:type="first" r:id="rId11"/>
+      <w:footerReference w:type="even" r:id="rId12"/>
+      <w:footerReference w:type="default" r:id="rId13"/>
+      <w:footerReference w:type="first" r:id="rId14"/>
       <w:type w:val="nextPage"/>
       <w:pgSz w:w="11906" w:h="16838"/>
       <w:pgMar w:left="1700" w:right="1559" w:gutter="0" w:header="726" w:top="1420" w:footer="970" w:bottom="1160"/>
@@ -2206,7 +2614,7 @@
   <w:p>
     <w:pPr>
       <w:pStyle w:val="BodyText"/>
-      <w:spacing w:lineRule="auto" w:line="12"/>
+      <w:spacing w:lineRule="auto" w:line="9"/>
       <w:ind w:hanging="0" w:left="0" w:right="0"/>
       <w:rPr/>
     </w:pPr>
@@ -2215,7 +2623,7 @@
       <mc:AlternateContent>
         <mc:Choice Requires="wps">
           <w:drawing>
-            <wp:anchor behindDoc="1" distT="0" distB="0" distL="0" distR="0" simplePos="0" locked="0" layoutInCell="0" allowOverlap="1" relativeHeight="12">
+            <wp:anchor behindDoc="1" distT="0" distB="0" distL="0" distR="0" simplePos="0" locked="0" layoutInCell="0" allowOverlap="1" relativeHeight="27">
               <wp:simplePos x="0" y="0"/>
               <wp:positionH relativeFrom="page">
                 <wp:posOffset>6386195</wp:posOffset>
@@ -2226,7 +2634,7 @@
               <wp:extent cx="106045" cy="179705"/>
               <wp:effectExtent l="0" t="0" r="0" b="0"/>
               <wp:wrapNone/>
-              <wp:docPr id="6" name="Textbox 3"/>
+              <wp:docPr id="12" name="Textbox 3"/>
               <a:graphic xmlns:a="http://schemas.openxmlformats.org/drawingml/2006/main">
                 <a:graphicData uri="http://schemas.microsoft.com/office/word/2010/wordprocessingShape">
                   <wps:wsp>
@@ -2257,10 +2665,13 @@
                             <w:pStyle w:val="BodyText"/>
                             <w:spacing w:before="19" w:after="0"/>
                             <w:ind w:hanging="0" w:left="20" w:right="0"/>
-                            <w:rPr/>
+                            <w:rPr>
+                              <w:color w:val="000000"/>
+                            </w:rPr>
                           </w:pPr>
                           <w:r>
                             <w:rPr>
+                              <w:color w:val="000000"/>
                               <w:spacing w:val="-10"/>
                             </w:rPr>
                             <w:t>1</w:t>
@@ -2289,10 +2700,13 @@
                       <w:pStyle w:val="BodyText"/>
                       <w:spacing w:before="19" w:after="0"/>
                       <w:ind w:hanging="0" w:left="20" w:right="0"/>
-                      <w:rPr/>
+                      <w:rPr>
+                        <w:color w:val="000000"/>
+                      </w:rPr>
                     </w:pPr>
                     <w:r>
                       <w:rPr>
+                        <w:color w:val="000000"/>
                         <w:spacing w:val="-10"/>
                       </w:rPr>
                       <w:t>1</w:t>
@@ -2315,7 +2729,7 @@
   <w:p>
     <w:pPr>
       <w:pStyle w:val="BodyText"/>
-      <w:spacing w:lineRule="auto" w:line="12"/>
+      <w:spacing w:lineRule="auto" w:line="9"/>
       <w:ind w:hanging="0" w:left="0" w:right="0"/>
       <w:rPr/>
     </w:pPr>
@@ -2324,7 +2738,7 @@
       <mc:AlternateContent>
         <mc:Choice Requires="wps">
           <w:drawing>
-            <wp:anchor behindDoc="1" distT="0" distB="0" distL="0" distR="0" simplePos="0" locked="0" layoutInCell="0" allowOverlap="1" relativeHeight="12">
+            <wp:anchor behindDoc="1" distT="0" distB="0" distL="0" distR="0" simplePos="0" locked="0" layoutInCell="0" allowOverlap="1" relativeHeight="27">
               <wp:simplePos x="0" y="0"/>
               <wp:positionH relativeFrom="page">
                 <wp:posOffset>6386195</wp:posOffset>
@@ -2335,7 +2749,7 @@
               <wp:extent cx="106045" cy="179705"/>
               <wp:effectExtent l="0" t="0" r="0" b="0"/>
               <wp:wrapNone/>
-              <wp:docPr id="7" name="Textbox 3"/>
+              <wp:docPr id="13" name="Textbox 3"/>
               <a:graphic xmlns:a="http://schemas.openxmlformats.org/drawingml/2006/main">
                 <a:graphicData uri="http://schemas.microsoft.com/office/word/2010/wordprocessingShape">
                   <wps:wsp>
@@ -2366,10 +2780,13 @@
                             <w:pStyle w:val="BodyText"/>
                             <w:spacing w:before="19" w:after="0"/>
                             <w:ind w:hanging="0" w:left="20" w:right="0"/>
-                            <w:rPr/>
+                            <w:rPr>
+                              <w:color w:val="000000"/>
+                            </w:rPr>
                           </w:pPr>
                           <w:r>
                             <w:rPr>
+                              <w:color w:val="000000"/>
                               <w:spacing w:val="-10"/>
                             </w:rPr>
                             <w:t>1</w:t>
@@ -2398,10 +2815,13 @@
                       <w:pStyle w:val="BodyText"/>
                       <w:spacing w:before="19" w:after="0"/>
                       <w:ind w:hanging="0" w:left="20" w:right="0"/>
-                      <w:rPr/>
+                      <w:rPr>
+                        <w:color w:val="000000"/>
+                      </w:rPr>
                     </w:pPr>
                     <w:r>
                       <w:rPr>
+                        <w:color w:val="000000"/>
                         <w:spacing w:val="-10"/>
                       </w:rPr>
                       <w:t>1</w:t>
@@ -2438,7 +2858,7 @@
   <w:p>
     <w:pPr>
       <w:pStyle w:val="BodyText"/>
-      <w:spacing w:lineRule="auto" w:line="12"/>
+      <w:spacing w:lineRule="auto" w:line="9"/>
       <w:ind w:hanging="0" w:left="0" w:right="0"/>
       <w:rPr/>
     </w:pPr>
@@ -2447,7 +2867,7 @@
       <mc:AlternateContent>
         <mc:Choice Requires="wps">
           <w:drawing>
-            <wp:anchor behindDoc="1" distT="0" distB="0" distL="0" distR="0" simplePos="0" locked="0" layoutInCell="0" allowOverlap="1" relativeHeight="4">
+            <wp:anchor behindDoc="1" distT="0" distB="0" distL="0" distR="0" simplePos="0" locked="0" layoutInCell="0" allowOverlap="1" relativeHeight="9">
               <wp:simplePos x="0" y="0"/>
               <wp:positionH relativeFrom="page">
                 <wp:posOffset>1068070</wp:posOffset>
@@ -2458,7 +2878,7 @@
               <wp:extent cx="1572260" cy="139700"/>
               <wp:effectExtent l="0" t="0" r="0" b="0"/>
               <wp:wrapNone/>
-              <wp:docPr id="2" name="Textbox 1"/>
+              <wp:docPr id="8" name="Textbox 1"/>
               <a:graphic xmlns:a="http://schemas.openxmlformats.org/drawingml/2006/main">
                 <a:graphicData uri="http://schemas.microsoft.com/office/word/2010/wordprocessingShape">
                   <wps:wsp>
@@ -2500,6 +2920,7 @@
                             <w:rPr>
                               <w:rFonts w:ascii="Calibri" w:hAnsi="Calibri"/>
                               <w:b/>
+                              <w:color w:val="000000"/>
                               <w:sz w:val="18"/>
                             </w:rPr>
                             <w:t>Sistemas</w:t>
@@ -2508,6 +2929,7 @@
                             <w:rPr>
                               <w:rFonts w:ascii="Calibri" w:hAnsi="Calibri"/>
                               <w:b/>
+                              <w:color w:val="000000"/>
                               <w:spacing w:val="-3"/>
                               <w:sz w:val="18"/>
                             </w:rPr>
@@ -2517,6 +2939,7 @@
                             <w:rPr>
                               <w:rFonts w:ascii="Calibri" w:hAnsi="Calibri"/>
                               <w:b/>
+                              <w:color w:val="000000"/>
                               <w:sz w:val="18"/>
                             </w:rPr>
                             <w:t>de Gestión</w:t>
@@ -2525,6 +2948,7 @@
                             <w:rPr>
                               <w:rFonts w:ascii="Calibri" w:hAnsi="Calibri"/>
                               <w:b/>
+                              <w:color w:val="000000"/>
                               <w:spacing w:val="-1"/>
                               <w:sz w:val="18"/>
                             </w:rPr>
@@ -2534,6 +2958,7 @@
                             <w:rPr>
                               <w:rFonts w:ascii="Calibri" w:hAnsi="Calibri"/>
                               <w:b/>
+                              <w:color w:val="000000"/>
                               <w:spacing w:val="-2"/>
                               <w:sz w:val="18"/>
                             </w:rPr>
@@ -2574,6 +2999,7 @@
                       <w:rPr>
                         <w:rFonts w:ascii="Calibri" w:hAnsi="Calibri"/>
                         <w:b/>
+                        <w:color w:val="000000"/>
                         <w:sz w:val="18"/>
                       </w:rPr>
                       <w:t>Sistemas</w:t>
@@ -2582,6 +3008,7 @@
                       <w:rPr>
                         <w:rFonts w:ascii="Calibri" w:hAnsi="Calibri"/>
                         <w:b/>
+                        <w:color w:val="000000"/>
                         <w:spacing w:val="-3"/>
                         <w:sz w:val="18"/>
                       </w:rPr>
@@ -2591,6 +3018,7 @@
                       <w:rPr>
                         <w:rFonts w:ascii="Calibri" w:hAnsi="Calibri"/>
                         <w:b/>
+                        <w:color w:val="000000"/>
                         <w:sz w:val="18"/>
                       </w:rPr>
                       <w:t>de Gestión</w:t>
@@ -2599,6 +3027,7 @@
                       <w:rPr>
                         <w:rFonts w:ascii="Calibri" w:hAnsi="Calibri"/>
                         <w:b/>
+                        <w:color w:val="000000"/>
                         <w:spacing w:val="-1"/>
                         <w:sz w:val="18"/>
                       </w:rPr>
@@ -2608,6 +3037,7 @@
                       <w:rPr>
                         <w:rFonts w:ascii="Calibri" w:hAnsi="Calibri"/>
                         <w:b/>
+                        <w:color w:val="000000"/>
                         <w:spacing w:val="-2"/>
                         <w:sz w:val="18"/>
                       </w:rPr>
@@ -2624,7 +3054,7 @@
       <mc:AlternateContent>
         <mc:Choice Requires="wps">
           <w:drawing>
-            <wp:anchor behindDoc="1" distT="0" distB="0" distL="0" distR="0" simplePos="0" locked="0" layoutInCell="0" allowOverlap="1" relativeHeight="8">
+            <wp:anchor behindDoc="1" distT="0" distB="0" distL="0" distR="0" simplePos="0" locked="0" layoutInCell="0" allowOverlap="1" relativeHeight="18">
               <wp:simplePos x="0" y="0"/>
               <wp:positionH relativeFrom="page">
                 <wp:posOffset>6092190</wp:posOffset>
@@ -2635,7 +3065,7 @@
               <wp:extent cx="400050" cy="139700"/>
               <wp:effectExtent l="0" t="0" r="0" b="0"/>
               <wp:wrapNone/>
-              <wp:docPr id="3" name="Textbox 2"/>
+              <wp:docPr id="9" name="Textbox 2"/>
               <a:graphic xmlns:a="http://schemas.openxmlformats.org/drawingml/2006/main">
                 <a:graphicData uri="http://schemas.microsoft.com/office/word/2010/wordprocessingShape">
                   <wps:wsp>
@@ -2677,6 +3107,7 @@
                             <w:rPr>
                               <w:rFonts w:ascii="Calibri" w:hAnsi="Calibri"/>
                               <w:b/>
+                              <w:color w:val="000000"/>
                               <w:sz w:val="18"/>
                             </w:rPr>
                             <w:t xml:space="preserve">2º </w:t>
@@ -2685,6 +3116,7 @@
                             <w:rPr>
                               <w:rFonts w:ascii="Calibri" w:hAnsi="Calibri"/>
                               <w:b/>
+                              <w:color w:val="000000"/>
                               <w:spacing w:val="-5"/>
                               <w:sz w:val="18"/>
                             </w:rPr>
@@ -2725,6 +3157,7 @@
                       <w:rPr>
                         <w:rFonts w:ascii="Calibri" w:hAnsi="Calibri"/>
                         <w:b/>
+                        <w:color w:val="000000"/>
                         <w:sz w:val="18"/>
                       </w:rPr>
                       <w:t xml:space="preserve">2º </w:t>
@@ -2733,6 +3166,7 @@
                       <w:rPr>
                         <w:rFonts w:ascii="Calibri" w:hAnsi="Calibri"/>
                         <w:b/>
+                        <w:color w:val="000000"/>
                         <w:spacing w:val="-5"/>
                         <w:sz w:val="18"/>
                       </w:rPr>
@@ -2756,7 +3190,7 @@
   <w:p>
     <w:pPr>
       <w:pStyle w:val="BodyText"/>
-      <w:spacing w:lineRule="auto" w:line="12"/>
+      <w:spacing w:lineRule="auto" w:line="9"/>
       <w:ind w:hanging="0" w:left="0" w:right="0"/>
       <w:rPr/>
     </w:pPr>
@@ -2765,7 +3199,7 @@
       <mc:AlternateContent>
         <mc:Choice Requires="wps">
           <w:drawing>
-            <wp:anchor behindDoc="1" distT="0" distB="0" distL="0" distR="0" simplePos="0" locked="0" layoutInCell="0" allowOverlap="1" relativeHeight="4">
+            <wp:anchor behindDoc="1" distT="0" distB="0" distL="0" distR="0" simplePos="0" locked="0" layoutInCell="0" allowOverlap="1" relativeHeight="9">
               <wp:simplePos x="0" y="0"/>
               <wp:positionH relativeFrom="page">
                 <wp:posOffset>1068070</wp:posOffset>
@@ -2776,7 +3210,7 @@
               <wp:extent cx="1572260" cy="139700"/>
               <wp:effectExtent l="0" t="0" r="0" b="0"/>
               <wp:wrapNone/>
-              <wp:docPr id="4" name="Textbox 1"/>
+              <wp:docPr id="10" name="Textbox 1"/>
               <a:graphic xmlns:a="http://schemas.openxmlformats.org/drawingml/2006/main">
                 <a:graphicData uri="http://schemas.microsoft.com/office/word/2010/wordprocessingShape">
                   <wps:wsp>
@@ -2818,6 +3252,7 @@
                             <w:rPr>
                               <w:rFonts w:ascii="Calibri" w:hAnsi="Calibri"/>
                               <w:b/>
+                              <w:color w:val="000000"/>
                               <w:sz w:val="18"/>
                             </w:rPr>
                             <w:t>Sistemas</w:t>
@@ -2826,6 +3261,7 @@
                             <w:rPr>
                               <w:rFonts w:ascii="Calibri" w:hAnsi="Calibri"/>
                               <w:b/>
+                              <w:color w:val="000000"/>
                               <w:spacing w:val="-3"/>
                               <w:sz w:val="18"/>
                             </w:rPr>
@@ -2835,6 +3271,7 @@
                             <w:rPr>
                               <w:rFonts w:ascii="Calibri" w:hAnsi="Calibri"/>
                               <w:b/>
+                              <w:color w:val="000000"/>
                               <w:sz w:val="18"/>
                             </w:rPr>
                             <w:t>de Gestión</w:t>
@@ -2843,6 +3280,7 @@
                             <w:rPr>
                               <w:rFonts w:ascii="Calibri" w:hAnsi="Calibri"/>
                               <w:b/>
+                              <w:color w:val="000000"/>
                               <w:spacing w:val="-1"/>
                               <w:sz w:val="18"/>
                             </w:rPr>
@@ -2852,6 +3290,7 @@
                             <w:rPr>
                               <w:rFonts w:ascii="Calibri" w:hAnsi="Calibri"/>
                               <w:b/>
+                              <w:color w:val="000000"/>
                               <w:spacing w:val="-2"/>
                               <w:sz w:val="18"/>
                             </w:rPr>
@@ -2892,6 +3331,7 @@
                       <w:rPr>
                         <w:rFonts w:ascii="Calibri" w:hAnsi="Calibri"/>
                         <w:b/>
+                        <w:color w:val="000000"/>
                         <w:sz w:val="18"/>
                       </w:rPr>
                       <w:t>Sistemas</w:t>
@@ -2900,6 +3340,7 @@
                       <w:rPr>
                         <w:rFonts w:ascii="Calibri" w:hAnsi="Calibri"/>
                         <w:b/>
+                        <w:color w:val="000000"/>
                         <w:spacing w:val="-3"/>
                         <w:sz w:val="18"/>
                       </w:rPr>
@@ -2909,6 +3350,7 @@
                       <w:rPr>
                         <w:rFonts w:ascii="Calibri" w:hAnsi="Calibri"/>
                         <w:b/>
+                        <w:color w:val="000000"/>
                         <w:sz w:val="18"/>
                       </w:rPr>
                       <w:t>de Gestión</w:t>
@@ -2917,6 +3359,7 @@
                       <w:rPr>
                         <w:rFonts w:ascii="Calibri" w:hAnsi="Calibri"/>
                         <w:b/>
+                        <w:color w:val="000000"/>
                         <w:spacing w:val="-1"/>
                         <w:sz w:val="18"/>
                       </w:rPr>
@@ -2926,6 +3369,7 @@
                       <w:rPr>
                         <w:rFonts w:ascii="Calibri" w:hAnsi="Calibri"/>
                         <w:b/>
+                        <w:color w:val="000000"/>
                         <w:spacing w:val="-2"/>
                         <w:sz w:val="18"/>
                       </w:rPr>
@@ -2942,7 +3386,7 @@
       <mc:AlternateContent>
         <mc:Choice Requires="wps">
           <w:drawing>
-            <wp:anchor behindDoc="1" distT="0" distB="0" distL="0" distR="0" simplePos="0" locked="0" layoutInCell="0" allowOverlap="1" relativeHeight="8">
+            <wp:anchor behindDoc="1" distT="0" distB="0" distL="0" distR="0" simplePos="0" locked="0" layoutInCell="0" allowOverlap="1" relativeHeight="18">
               <wp:simplePos x="0" y="0"/>
               <wp:positionH relativeFrom="page">
                 <wp:posOffset>6092190</wp:posOffset>
@@ -2953,7 +3397,7 @@
               <wp:extent cx="400050" cy="139700"/>
               <wp:effectExtent l="0" t="0" r="0" b="0"/>
               <wp:wrapNone/>
-              <wp:docPr id="5" name="Textbox 2"/>
+              <wp:docPr id="11" name="Textbox 2"/>
               <a:graphic xmlns:a="http://schemas.openxmlformats.org/drawingml/2006/main">
                 <a:graphicData uri="http://schemas.microsoft.com/office/word/2010/wordprocessingShape">
                   <wps:wsp>
@@ -2995,6 +3439,7 @@
                             <w:rPr>
                               <w:rFonts w:ascii="Calibri" w:hAnsi="Calibri"/>
                               <w:b/>
+                              <w:color w:val="000000"/>
                               <w:sz w:val="18"/>
                             </w:rPr>
                             <w:t xml:space="preserve">2º </w:t>
@@ -3003,6 +3448,7 @@
                             <w:rPr>
                               <w:rFonts w:ascii="Calibri" w:hAnsi="Calibri"/>
                               <w:b/>
+                              <w:color w:val="000000"/>
                               <w:spacing w:val="-5"/>
                               <w:sz w:val="18"/>
                             </w:rPr>
@@ -3043,6 +3489,7 @@
                       <w:rPr>
                         <w:rFonts w:ascii="Calibri" w:hAnsi="Calibri"/>
                         <w:b/>
+                        <w:color w:val="000000"/>
                         <w:sz w:val="18"/>
                       </w:rPr>
                       <w:t xml:space="preserve">2º </w:t>
@@ -3051,6 +3498,7 @@
                       <w:rPr>
                         <w:rFonts w:ascii="Calibri" w:hAnsi="Calibri"/>
                         <w:b/>
+                        <w:color w:val="000000"/>
                         <w:spacing w:val="-5"/>
                         <w:sz w:val="18"/>
                       </w:rPr>
@@ -3391,6 +3839,7 @@
     <w:qFormat/>
     <w:pPr>
       <w:widowControl w:val="false"/>
+      <w:suppressAutoHyphens w:val="true"/>
       <w:bidi w:val="0"/>
       <w:spacing w:lineRule="auto" w:line="240" w:before="0" w:after="0"/>
       <w:ind w:left="0" w:right="0"/>

</xml_diff>